<commit_message>
Add campaign start date validation + improve CSV export
</commit_message>
<xml_diff>
--- a/הערות-זמני.docx
+++ b/הערות-זמני.docx
@@ -791,39 +791,7 @@
           <w:rtl/>
         </w:rPr>
         <w:lastRenderedPageBreak/>
-        <w:t>במצב 'מנהל' צריך שיהיה</w:t>
-      </w:r>
-      <w:r>
-        <w:rPr>
-          <w:rFonts w:hint="cs"/>
-          <w:color w:val="00B050"/>
-          <w:rtl/>
-        </w:rPr>
-        <w:t xml:space="preserve"> באיזור "ניהול" </w:t>
-      </w:r>
-      <w:r>
-        <w:rPr>
-          <w:rFonts w:hint="cs"/>
-          <w:color w:val="00B050"/>
-          <w:rtl/>
-        </w:rPr>
-        <w:t>(</w:t>
-      </w:r>
-      <w:r>
-        <w:rPr>
-          <w:rFonts w:hint="cs"/>
-          <w:color w:val="00B050"/>
-          <w:rtl/>
-        </w:rPr>
-        <w:t>שמופיע כשנכנסים למצב מנהל</w:t>
-      </w:r>
-      <w:r>
-        <w:rPr>
-          <w:rFonts w:hint="cs"/>
-          <w:color w:val="00B050"/>
-          <w:rtl/>
-        </w:rPr>
-        <w:t>) לינק עם כפתור להעתקת הקישור למילוי הטופס לשליחה למשתתפים (כמו שיש מיד בסיום יצירת הקמפיין). כפתור אחד שבקליק מעתיק את הקישור להזנת התוכן.</w:t>
+        <w:t>במצב 'מנהל' צריך שיהיה באיזור "ניהול" (שמופיע כשנכנסים למצב מנהל) לינק עם כפתור להעתקת הקישור למילוי הטופס לשליחה למשתתפים (כמו שיש מיד בסיום יצירת הקמפיין). כפתור אחד שבקליק מעתיק את הקישור להזנת התוכן.</w:t>
       </w:r>
     </w:p>
     <w:p>
@@ -963,6 +931,7 @@
       <w:pPr>
         <w:rPr>
           <w:rFonts w:cs="Arial"/>
+          <w:color w:val="00B050"/>
           <w:u w:val="single"/>
           <w:rtl/>
         </w:rPr>
@@ -970,6 +939,7 @@
       <w:r>
         <w:rPr>
           <w:rFonts w:cs="Arial" w:hint="cs"/>
+          <w:color w:val="00B050"/>
           <w:u w:val="single"/>
           <w:rtl/>
         </w:rPr>
@@ -978,13 +948,500 @@
     </w:p>
     <w:p>
       <w:pPr>
-        <w:rPr>
-          <w:rFonts w:hint="cs"/>
-          <w:rtl/>
-        </w:rPr>
-      </w:pPr>
+        <w:pStyle w:val="ListParagraph"/>
+        <w:numPr>
+          <w:ilvl w:val="0"/>
+          <w:numId w:val="9"/>
+        </w:numPr>
+        <w:rPr>
+          <w:color w:val="00B050"/>
+        </w:rPr>
+      </w:pPr>
+      <w:r>
+        <w:rPr>
+          <w:rFonts w:hint="cs"/>
+          <w:color w:val="00B050"/>
+          <w:rtl/>
+        </w:rPr>
+        <w:t>הסיסמא בקמפיין שפתחתי "קמפיין דוגמא: מניעת אלימות בזוגיות צעירה" שגויה. לא ברור למה.</w:t>
+      </w:r>
+    </w:p>
+    <w:p>
+      <w:pPr>
+        <w:pStyle w:val="ListParagraph"/>
+        <w:numPr>
+          <w:ilvl w:val="0"/>
+          <w:numId w:val="9"/>
+        </w:numPr>
+        <w:rPr>
+          <w:color w:val="00B050"/>
+        </w:rPr>
+      </w:pPr>
+      <w:r>
+        <w:rPr>
+          <w:rFonts w:hint="cs"/>
+          <w:color w:val="00B050"/>
+          <w:rtl/>
+        </w:rPr>
+        <w:t>צריך שהיעדים יהיו מוזנים מתוך האפשרויות הקיימות ולא כטקסט חופשי, כדי שהם ידעו לשאוב מה</w:t>
+      </w:r>
+      <w:r>
+        <w:rPr>
+          <w:rFonts w:hint="cs"/>
+          <w:color w:val="00B050"/>
+          <w:rtl/>
+        </w:rPr>
+        <w:t>שדות הנכונים. כלומר צריך שביצירת היעדים תהיה אפשרות לבחור פלטפורמה ואז עבור כל פלטפורמה יופיעו סוגי המדדים שרלוונטיים אליה ועבורם להזין את היעדים.</w:t>
+      </w:r>
+    </w:p>
+    <w:p>
+      <w:pPr>
+        <w:pStyle w:val="ListParagraph"/>
+        <w:numPr>
+          <w:ilvl w:val="0"/>
+          <w:numId w:val="9"/>
+        </w:numPr>
+        <w:rPr>
+          <w:color w:val="00B050"/>
+        </w:rPr>
+      </w:pPr>
+      <w:r>
+        <w:rPr>
+          <w:rFonts w:hint="cs"/>
+          <w:color w:val="00B050"/>
+          <w:rtl/>
+        </w:rPr>
+        <w:t>חוץ מהיעדים בתוך הפלטפורמה צריך שיהיו יעדים כלליים לקמפיין כמו חשיפות כוללות, אינטראקציות, כמות תכנים, משתתפים פעילים, כמות פלטפורמות.</w:t>
+      </w:r>
+    </w:p>
+    <w:p>
+      <w:pPr>
+        <w:pStyle w:val="ListParagraph"/>
+        <w:numPr>
+          <w:ilvl w:val="0"/>
+          <w:numId w:val="9"/>
+        </w:numPr>
+        <w:pBdr>
+          <w:bottom w:val="single" w:sz="6" w:space="1" w:color="auto"/>
+        </w:pBdr>
+        <w:rPr>
+          <w:color w:val="00B050"/>
+        </w:rPr>
+      </w:pPr>
+      <w:r>
+        <w:rPr>
+          <w:rFonts w:hint="cs"/>
+          <w:color w:val="00B050"/>
+          <w:rtl/>
+        </w:rPr>
+        <w:t>בסעיף 1 אלו היעדים המשניים (ברמת הפלטפורמה) ובסעיף 2 אלו היעדים הראשיים של הקמפיין). אף אחד מהיעדים הנ"ל אינו חובה, אבל צריך להיות ממשק מאוד מובנה שמדריך את האדמינית איך להגדיר את היעדים הללו, וכמו שכתבתי זה חייב להיות מחובר לנתונים הגולמיים של הדאטה-בייס כדי שלא יהיו יעדים שהקוד לא יבין למה הם מקושרים. תציע את איך זה ייראה ואת הלוגיקה מאחורי זה. כמה שיותר פשוט.</w:t>
+      </w:r>
+    </w:p>
+    <w:p>
+      <w:pPr>
+        <w:rPr>
+          <w:rtl/>
+        </w:rPr>
+      </w:pPr>
+    </w:p>
+    <w:p>
+      <w:pPr>
+        <w:rPr>
+          <w:color w:val="00B050"/>
+          <w:rtl/>
+        </w:rPr>
+      </w:pPr>
+      <w:r>
+        <w:rPr>
+          <w:rFonts w:hint="cs"/>
+          <w:color w:val="00B050"/>
+          <w:rtl/>
+        </w:rPr>
+        <w:t>אני רוצה לתקן את מארז ההדרכה, כי צילומי המסך הם לא אמיתיים וזה יוצר תמונה מעוותת.</w:t>
+      </w:r>
+    </w:p>
+    <w:p>
+      <w:pPr>
+        <w:pStyle w:val="ListParagraph"/>
+        <w:numPr>
+          <w:ilvl w:val="0"/>
+          <w:numId w:val="11"/>
+        </w:numPr>
+        <w:rPr>
+          <w:color w:val="00B050"/>
+          <w:rtl/>
+        </w:rPr>
+      </w:pPr>
+      <w:r>
+        <w:rPr>
+          <w:rFonts w:hint="cs"/>
+          <w:color w:val="00B050"/>
+          <w:rtl/>
+        </w:rPr>
+        <w:t xml:space="preserve">אני רוצה שיהיה רק טקסט (כמובן, יפה נקי ומסודר באותו פורמט ירוק שכתבת אותו </w:t>
+      </w:r>
+      <w:r>
+        <w:rPr>
+          <w:color w:val="00B050"/>
+          <w:rtl/>
+        </w:rPr>
+        <w:t>–</w:t>
+      </w:r>
+      <w:r>
+        <w:rPr>
+          <w:rFonts w:hint="cs"/>
+          <w:color w:val="00B050"/>
+          <w:rtl/>
+        </w:rPr>
+        <w:t xml:space="preserve"> אבל בלי אימוג'יז כי זה קצת מוזיל את הנראות).</w:t>
+      </w:r>
+    </w:p>
+    <w:p>
+      <w:pPr>
+        <w:pStyle w:val="ListParagraph"/>
+        <w:numPr>
+          <w:ilvl w:val="0"/>
+          <w:numId w:val="11"/>
+        </w:numPr>
+        <w:rPr>
+          <w:color w:val="00B050"/>
+        </w:rPr>
+      </w:pPr>
+      <w:r>
+        <w:rPr>
+          <w:rFonts w:hint="cs"/>
+          <w:color w:val="00B050"/>
+          <w:rtl/>
+        </w:rPr>
+        <w:t>במקום "מה זו המערכת" תכתוב "הקדמה".</w:t>
+      </w:r>
+    </w:p>
+    <w:p>
+      <w:pPr>
+        <w:pStyle w:val="ListParagraph"/>
+        <w:numPr>
+          <w:ilvl w:val="0"/>
+          <w:numId w:val="11"/>
+        </w:numPr>
+        <w:rPr>
+          <w:color w:val="00B050"/>
+          <w:rtl/>
+        </w:rPr>
+      </w:pPr>
+      <w:r>
+        <w:rPr>
+          <w:rFonts w:hint="cs"/>
+          <w:color w:val="00B050"/>
+          <w:rtl/>
+        </w:rPr>
+        <w:t xml:space="preserve">לאורך כל המדריך, אל תכתוב כאילו אתה מדבר אליהם, אלא כאילו אתה מתאר את המערכת והשימוש בה </w:t>
+      </w:r>
+      <w:r>
+        <w:rPr>
+          <w:color w:val="00B050"/>
+          <w:rtl/>
+        </w:rPr>
+        <w:t>–</w:t>
+      </w:r>
+      <w:r>
+        <w:rPr>
+          <w:rFonts w:hint="cs"/>
+          <w:color w:val="00B050"/>
+          <w:rtl/>
+        </w:rPr>
+        <w:t xml:space="preserve"> לא "המערכת מאפשרת לכם לעקוב </w:t>
+      </w:r>
+      <w:r>
+        <w:rPr>
+          <w:rFonts w:ascii="Arial" w:hAnsi="Arial" w:cs="Arial"/>
+          <w:color w:val="00B050"/>
+          <w:shd w:val="clear" w:color="auto" w:fill="FFFFFF"/>
+          <w:rtl/>
+        </w:rPr>
+        <w:t>אחרי ההשפעה של התכנים שאתם מפרסמים ברשתות החברתיות</w:t>
+      </w:r>
+      <w:r>
+        <w:rPr>
+          <w:rFonts w:ascii="Arial" w:hAnsi="Arial" w:cs="Arial" w:hint="cs"/>
+          <w:color w:val="00B050"/>
+          <w:shd w:val="clear" w:color="auto" w:fill="FFFFFF"/>
+          <w:rtl/>
+        </w:rPr>
+        <w:t>", אלא "המערכת מאפשרת מעקב אחר השפעת תכנים המפורסמים ברשתות החברתיות".</w:t>
+      </w:r>
+    </w:p>
+    <w:p>
+      <w:pPr>
+        <w:pStyle w:val="ListParagraph"/>
+        <w:numPr>
+          <w:ilvl w:val="0"/>
+          <w:numId w:val="11"/>
+        </w:numPr>
+        <w:rPr>
+          <w:color w:val="00B050"/>
+          <w:rtl/>
+        </w:rPr>
+      </w:pPr>
+      <w:r>
+        <w:rPr>
+          <w:rFonts w:hint="cs"/>
+          <w:color w:val="00B050"/>
+          <w:rtl/>
+        </w:rPr>
+        <w:t xml:space="preserve">צריך גם שיהיה סקשן של "שימוש ראשוני" או "לפני תחילת עבודה ראשונה" שכתוב בו משהו על זה שמיכל תקבל מוצר "ריק" ותתחיל לעבוד איתו מאפס </w:t>
+      </w:r>
+      <w:r>
+        <w:rPr>
+          <w:color w:val="00B050"/>
+          <w:rtl/>
+        </w:rPr>
+        <w:t>–</w:t>
+      </w:r>
+      <w:r>
+        <w:rPr>
+          <w:rFonts w:hint="cs"/>
+          <w:color w:val="00B050"/>
+          <w:rtl/>
+        </w:rPr>
+        <w:t xml:space="preserve"> ממש כמו שיהיה במציאות.</w:t>
+      </w:r>
+    </w:p>
+    <w:p>
+      <w:pPr>
+        <w:pStyle w:val="ListParagraph"/>
+        <w:numPr>
+          <w:ilvl w:val="0"/>
+          <w:numId w:val="11"/>
+        </w:numPr>
+        <w:rPr>
+          <w:color w:val="00B050"/>
+          <w:rtl/>
+        </w:rPr>
+      </w:pPr>
+      <w:r>
+        <w:rPr>
+          <w:rFonts w:hint="cs"/>
+          <w:color w:val="00B050"/>
+          <w:rtl/>
+        </w:rPr>
+        <w:t>סדר העבודה הכללי צריך להיו</w:t>
+      </w:r>
       <w:bookmarkStart w:id="0" w:name="_GoBack"/>
       <w:bookmarkEnd w:id="0"/>
+      <w:r>
+        <w:rPr>
+          <w:rFonts w:hint="cs"/>
+          <w:color w:val="00B050"/>
+          <w:rtl/>
+        </w:rPr>
+        <w:t>ת:</w:t>
+      </w:r>
+    </w:p>
+    <w:p>
+      <w:pPr>
+        <w:pStyle w:val="ListParagraph"/>
+        <w:numPr>
+          <w:ilvl w:val="1"/>
+          <w:numId w:val="11"/>
+        </w:numPr>
+        <w:rPr>
+          <w:color w:val="00B050"/>
+        </w:rPr>
+      </w:pPr>
+      <w:r>
+        <w:rPr>
+          <w:rFonts w:hint="cs"/>
+          <w:color w:val="00B050"/>
+          <w:rtl/>
+        </w:rPr>
+        <w:t>פתיחת דשבורד</w:t>
+      </w:r>
+    </w:p>
+    <w:p>
+      <w:pPr>
+        <w:pStyle w:val="ListParagraph"/>
+        <w:numPr>
+          <w:ilvl w:val="1"/>
+          <w:numId w:val="11"/>
+        </w:numPr>
+        <w:rPr>
+          <w:color w:val="00B050"/>
+        </w:rPr>
+      </w:pPr>
+      <w:r>
+        <w:rPr>
+          <w:rFonts w:hint="cs"/>
+          <w:color w:val="00B050"/>
+          <w:rtl/>
+        </w:rPr>
+        <w:t>כניסה למצב "מנהל"</w:t>
+      </w:r>
+    </w:p>
+    <w:p>
+      <w:pPr>
+        <w:pStyle w:val="ListParagraph"/>
+        <w:numPr>
+          <w:ilvl w:val="1"/>
+          <w:numId w:val="11"/>
+        </w:numPr>
+        <w:rPr>
+          <w:color w:val="00B050"/>
+        </w:rPr>
+      </w:pPr>
+      <w:r>
+        <w:rPr>
+          <w:rFonts w:hint="cs"/>
+          <w:color w:val="00B050"/>
+          <w:rtl/>
+        </w:rPr>
+        <w:t>בניית קמפיין (כולל ניהול מאגר המשתתפים והגדרת יעדים)</w:t>
+      </w:r>
+    </w:p>
+    <w:p>
+      <w:pPr>
+        <w:pStyle w:val="ListParagraph"/>
+        <w:numPr>
+          <w:ilvl w:val="1"/>
+          <w:numId w:val="11"/>
+        </w:numPr>
+        <w:rPr>
+          <w:color w:val="00B050"/>
+        </w:rPr>
+      </w:pPr>
+      <w:r>
+        <w:rPr>
+          <w:rFonts w:hint="cs"/>
+          <w:color w:val="00B050"/>
+          <w:rtl/>
+        </w:rPr>
+        <w:t>הפצת הלינק להזנת התוכן</w:t>
+      </w:r>
+    </w:p>
+    <w:p>
+      <w:pPr>
+        <w:pStyle w:val="ListParagraph"/>
+        <w:numPr>
+          <w:ilvl w:val="1"/>
+          <w:numId w:val="11"/>
+        </w:numPr>
+        <w:rPr>
+          <w:color w:val="00B050"/>
+        </w:rPr>
+      </w:pPr>
+      <w:r>
+        <w:rPr>
+          <w:rFonts w:hint="cs"/>
+          <w:color w:val="00B050"/>
+          <w:rtl/>
+        </w:rPr>
+        <w:t>הזנת תכנים ראשונית</w:t>
+      </w:r>
+    </w:p>
+    <w:p>
+      <w:pPr>
+        <w:pStyle w:val="ListParagraph"/>
+        <w:numPr>
+          <w:ilvl w:val="1"/>
+          <w:numId w:val="11"/>
+        </w:numPr>
+        <w:rPr>
+          <w:color w:val="00B050"/>
+        </w:rPr>
+      </w:pPr>
+      <w:r>
+        <w:rPr>
+          <w:rFonts w:hint="cs"/>
+          <w:color w:val="00B050"/>
+          <w:rtl/>
+        </w:rPr>
+        <w:t>עדכון נתונים</w:t>
+      </w:r>
+    </w:p>
+    <w:p>
+      <w:pPr>
+        <w:pStyle w:val="ListParagraph"/>
+        <w:numPr>
+          <w:ilvl w:val="1"/>
+          <w:numId w:val="11"/>
+        </w:numPr>
+        <w:rPr>
+          <w:color w:val="00B050"/>
+        </w:rPr>
+      </w:pPr>
+      <w:r>
+        <w:rPr>
+          <w:rFonts w:hint="cs"/>
+          <w:color w:val="00B050"/>
+          <w:rtl/>
+        </w:rPr>
+        <w:lastRenderedPageBreak/>
+        <w:t>צפייה בדשבורד</w:t>
+      </w:r>
+    </w:p>
+    <w:p>
+      <w:pPr>
+        <w:pStyle w:val="ListParagraph"/>
+        <w:numPr>
+          <w:ilvl w:val="1"/>
+          <w:numId w:val="11"/>
+        </w:numPr>
+        <w:rPr>
+          <w:color w:val="00B050"/>
+        </w:rPr>
+      </w:pPr>
+      <w:r>
+        <w:rPr>
+          <w:rFonts w:hint="cs"/>
+          <w:color w:val="00B050"/>
+          <w:rtl/>
+        </w:rPr>
+        <w:t xml:space="preserve">עריכת דשבורד במצב מנהל (שינוי סטטוס, עריכת מדדים, הוספת משתמשים וארגונים, מחיקת קמפיין, </w:t>
+      </w:r>
+    </w:p>
+    <w:p>
+      <w:pPr>
+        <w:pStyle w:val="ListParagraph"/>
+        <w:numPr>
+          <w:ilvl w:val="1"/>
+          <w:numId w:val="11"/>
+        </w:numPr>
+        <w:rPr>
+          <w:color w:val="00B050"/>
+        </w:rPr>
+      </w:pPr>
+      <w:r>
+        <w:rPr>
+          <w:rFonts w:hint="cs"/>
+          <w:color w:val="00B050"/>
+          <w:highlight w:val="yellow"/>
+          <w:rtl/>
+        </w:rPr>
+        <w:t>&lt;פספסתי משהו?</w:t>
+      </w:r>
+      <w:r>
+        <w:rPr>
+          <w:rFonts w:hint="cs"/>
+          <w:color w:val="00B050"/>
+          <w:rtl/>
+        </w:rPr>
+        <w:t xml:space="preserve"> אם כן תציע לפני שאתה מוסיף&gt;</w:t>
+      </w:r>
+    </w:p>
+    <w:p>
+      <w:pPr>
+        <w:rPr>
+          <w:color w:val="00B050"/>
+          <w:rtl/>
+        </w:rPr>
+      </w:pPr>
+    </w:p>
+    <w:p>
+      <w:pPr>
+        <w:rPr>
+          <w:rFonts w:hint="cs"/>
+          <w:rtl/>
+        </w:rPr>
+      </w:pPr>
     </w:p>
     <w:sectPr>
       <w:pgSz w:w="11906" w:h="16838"/>
@@ -1621,6 +2078,95 @@
     </w:lvl>
   </w:abstractNum>
   <w:abstractNum w:abstractNumId="7" w15:restartNumberingAfterBreak="0">
+    <w:nsid w:val="69F536BF"/>
+    <w:multiLevelType w:val="hybridMultilevel"/>
+    <w:tmpl w:val="AA08A14A"/>
+    <w:lvl w:ilvl="0" w:tplc="0409000F">
+      <w:start w:val="1"/>
+      <w:numFmt w:val="decimal"/>
+      <w:lvlText w:val="%1."/>
+      <w:lvlJc w:val="left"/>
+      <w:pPr>
+        <w:ind w:left="720" w:hanging="360"/>
+      </w:pPr>
+      <w:rPr>
+        <w:rFonts w:hint="default"/>
+      </w:rPr>
+    </w:lvl>
+    <w:lvl w:ilvl="1" w:tplc="04090019" w:tentative="1">
+      <w:start w:val="1"/>
+      <w:numFmt w:val="lowerLetter"/>
+      <w:lvlText w:val="%2."/>
+      <w:lvlJc w:val="left"/>
+      <w:pPr>
+        <w:ind w:left="1440" w:hanging="360"/>
+      </w:pPr>
+    </w:lvl>
+    <w:lvl w:ilvl="2" w:tplc="0409001B" w:tentative="1">
+      <w:start w:val="1"/>
+      <w:numFmt w:val="lowerRoman"/>
+      <w:lvlText w:val="%3."/>
+      <w:lvlJc w:val="right"/>
+      <w:pPr>
+        <w:ind w:left="2160" w:hanging="180"/>
+      </w:pPr>
+    </w:lvl>
+    <w:lvl w:ilvl="3" w:tplc="0409000F" w:tentative="1">
+      <w:start w:val="1"/>
+      <w:numFmt w:val="decimal"/>
+      <w:lvlText w:val="%4."/>
+      <w:lvlJc w:val="left"/>
+      <w:pPr>
+        <w:ind w:left="2880" w:hanging="360"/>
+      </w:pPr>
+    </w:lvl>
+    <w:lvl w:ilvl="4" w:tplc="04090019" w:tentative="1">
+      <w:start w:val="1"/>
+      <w:numFmt w:val="lowerLetter"/>
+      <w:lvlText w:val="%5."/>
+      <w:lvlJc w:val="left"/>
+      <w:pPr>
+        <w:ind w:left="3600" w:hanging="360"/>
+      </w:pPr>
+    </w:lvl>
+    <w:lvl w:ilvl="5" w:tplc="0409001B" w:tentative="1">
+      <w:start w:val="1"/>
+      <w:numFmt w:val="lowerRoman"/>
+      <w:lvlText w:val="%6."/>
+      <w:lvlJc w:val="right"/>
+      <w:pPr>
+        <w:ind w:left="4320" w:hanging="180"/>
+      </w:pPr>
+    </w:lvl>
+    <w:lvl w:ilvl="6" w:tplc="0409000F" w:tentative="1">
+      <w:start w:val="1"/>
+      <w:numFmt w:val="decimal"/>
+      <w:lvlText w:val="%7."/>
+      <w:lvlJc w:val="left"/>
+      <w:pPr>
+        <w:ind w:left="5040" w:hanging="360"/>
+      </w:pPr>
+    </w:lvl>
+    <w:lvl w:ilvl="7" w:tplc="04090019" w:tentative="1">
+      <w:start w:val="1"/>
+      <w:numFmt w:val="lowerLetter"/>
+      <w:lvlText w:val="%8."/>
+      <w:lvlJc w:val="left"/>
+      <w:pPr>
+        <w:ind w:left="5760" w:hanging="360"/>
+      </w:pPr>
+    </w:lvl>
+    <w:lvl w:ilvl="8" w:tplc="0409001B" w:tentative="1">
+      <w:start w:val="1"/>
+      <w:numFmt w:val="lowerRoman"/>
+      <w:lvlText w:val="%9."/>
+      <w:lvlJc w:val="right"/>
+      <w:pPr>
+        <w:ind w:left="6480" w:hanging="180"/>
+      </w:pPr>
+    </w:lvl>
+  </w:abstractNum>
+  <w:abstractNum w:abstractNumId="8" w15:restartNumberingAfterBreak="0">
     <w:nsid w:val="74856F6B"/>
     <w:multiLevelType w:val="hybridMultilevel"/>
     <w:tmpl w:val="3DA8DF9C"/>
@@ -1706,8 +2252,183 @@
       </w:pPr>
     </w:lvl>
   </w:abstractNum>
+  <w:abstractNum w:abstractNumId="9" w15:restartNumberingAfterBreak="0">
+    <w:nsid w:val="79464EDB"/>
+    <w:multiLevelType w:val="hybridMultilevel"/>
+    <w:tmpl w:val="0CEE4808"/>
+    <w:lvl w:ilvl="0" w:tplc="0409000F">
+      <w:start w:val="1"/>
+      <w:numFmt w:val="decimal"/>
+      <w:lvlText w:val="%1."/>
+      <w:lvlJc w:val="left"/>
+      <w:pPr>
+        <w:ind w:left="720" w:hanging="360"/>
+      </w:pPr>
+      <w:rPr>
+        <w:rFonts w:hint="default"/>
+      </w:rPr>
+    </w:lvl>
+    <w:lvl w:ilvl="1" w:tplc="04090019" w:tentative="1">
+      <w:start w:val="1"/>
+      <w:numFmt w:val="lowerLetter"/>
+      <w:lvlText w:val="%2."/>
+      <w:lvlJc w:val="left"/>
+      <w:pPr>
+        <w:ind w:left="1440" w:hanging="360"/>
+      </w:pPr>
+    </w:lvl>
+    <w:lvl w:ilvl="2" w:tplc="0409001B" w:tentative="1">
+      <w:start w:val="1"/>
+      <w:numFmt w:val="lowerRoman"/>
+      <w:lvlText w:val="%3."/>
+      <w:lvlJc w:val="right"/>
+      <w:pPr>
+        <w:ind w:left="2160" w:hanging="180"/>
+      </w:pPr>
+    </w:lvl>
+    <w:lvl w:ilvl="3" w:tplc="0409000F" w:tentative="1">
+      <w:start w:val="1"/>
+      <w:numFmt w:val="decimal"/>
+      <w:lvlText w:val="%4."/>
+      <w:lvlJc w:val="left"/>
+      <w:pPr>
+        <w:ind w:left="2880" w:hanging="360"/>
+      </w:pPr>
+    </w:lvl>
+    <w:lvl w:ilvl="4" w:tplc="04090019" w:tentative="1">
+      <w:start w:val="1"/>
+      <w:numFmt w:val="lowerLetter"/>
+      <w:lvlText w:val="%5."/>
+      <w:lvlJc w:val="left"/>
+      <w:pPr>
+        <w:ind w:left="3600" w:hanging="360"/>
+      </w:pPr>
+    </w:lvl>
+    <w:lvl w:ilvl="5" w:tplc="0409001B" w:tentative="1">
+      <w:start w:val="1"/>
+      <w:numFmt w:val="lowerRoman"/>
+      <w:lvlText w:val="%6."/>
+      <w:lvlJc w:val="right"/>
+      <w:pPr>
+        <w:ind w:left="4320" w:hanging="180"/>
+      </w:pPr>
+    </w:lvl>
+    <w:lvl w:ilvl="6" w:tplc="0409000F" w:tentative="1">
+      <w:start w:val="1"/>
+      <w:numFmt w:val="decimal"/>
+      <w:lvlText w:val="%7."/>
+      <w:lvlJc w:val="left"/>
+      <w:pPr>
+        <w:ind w:left="5040" w:hanging="360"/>
+      </w:pPr>
+    </w:lvl>
+    <w:lvl w:ilvl="7" w:tplc="04090019" w:tentative="1">
+      <w:start w:val="1"/>
+      <w:numFmt w:val="lowerLetter"/>
+      <w:lvlText w:val="%8."/>
+      <w:lvlJc w:val="left"/>
+      <w:pPr>
+        <w:ind w:left="5760" w:hanging="360"/>
+      </w:pPr>
+    </w:lvl>
+    <w:lvl w:ilvl="8" w:tplc="0409001B" w:tentative="1">
+      <w:start w:val="1"/>
+      <w:numFmt w:val="lowerRoman"/>
+      <w:lvlText w:val="%9."/>
+      <w:lvlJc w:val="right"/>
+      <w:pPr>
+        <w:ind w:left="6480" w:hanging="180"/>
+      </w:pPr>
+    </w:lvl>
+  </w:abstractNum>
+  <w:abstractNum w:abstractNumId="10" w15:restartNumberingAfterBreak="0">
+    <w:nsid w:val="7DD413AA"/>
+    <w:multiLevelType w:val="hybridMultilevel"/>
+    <w:tmpl w:val="2FAAD78C"/>
+    <w:lvl w:ilvl="0" w:tplc="0409000F">
+      <w:start w:val="1"/>
+      <w:numFmt w:val="decimal"/>
+      <w:lvlText w:val="%1."/>
+      <w:lvlJc w:val="left"/>
+      <w:pPr>
+        <w:ind w:left="720" w:hanging="360"/>
+      </w:pPr>
+    </w:lvl>
+    <w:lvl w:ilvl="1" w:tplc="04090019">
+      <w:start w:val="1"/>
+      <w:numFmt w:val="lowerLetter"/>
+      <w:lvlText w:val="%2."/>
+      <w:lvlJc w:val="left"/>
+      <w:pPr>
+        <w:ind w:left="1440" w:hanging="360"/>
+      </w:pPr>
+    </w:lvl>
+    <w:lvl w:ilvl="2" w:tplc="0409001B" w:tentative="1">
+      <w:start w:val="1"/>
+      <w:numFmt w:val="lowerRoman"/>
+      <w:lvlText w:val="%3."/>
+      <w:lvlJc w:val="right"/>
+      <w:pPr>
+        <w:ind w:left="2160" w:hanging="180"/>
+      </w:pPr>
+    </w:lvl>
+    <w:lvl w:ilvl="3" w:tplc="0409000F" w:tentative="1">
+      <w:start w:val="1"/>
+      <w:numFmt w:val="decimal"/>
+      <w:lvlText w:val="%4."/>
+      <w:lvlJc w:val="left"/>
+      <w:pPr>
+        <w:ind w:left="2880" w:hanging="360"/>
+      </w:pPr>
+    </w:lvl>
+    <w:lvl w:ilvl="4" w:tplc="04090019" w:tentative="1">
+      <w:start w:val="1"/>
+      <w:numFmt w:val="lowerLetter"/>
+      <w:lvlText w:val="%5."/>
+      <w:lvlJc w:val="left"/>
+      <w:pPr>
+        <w:ind w:left="3600" w:hanging="360"/>
+      </w:pPr>
+    </w:lvl>
+    <w:lvl w:ilvl="5" w:tplc="0409001B" w:tentative="1">
+      <w:start w:val="1"/>
+      <w:numFmt w:val="lowerRoman"/>
+      <w:lvlText w:val="%6."/>
+      <w:lvlJc w:val="right"/>
+      <w:pPr>
+        <w:ind w:left="4320" w:hanging="180"/>
+      </w:pPr>
+    </w:lvl>
+    <w:lvl w:ilvl="6" w:tplc="0409000F" w:tentative="1">
+      <w:start w:val="1"/>
+      <w:numFmt w:val="decimal"/>
+      <w:lvlText w:val="%7."/>
+      <w:lvlJc w:val="left"/>
+      <w:pPr>
+        <w:ind w:left="5040" w:hanging="360"/>
+      </w:pPr>
+    </w:lvl>
+    <w:lvl w:ilvl="7" w:tplc="04090019" w:tentative="1">
+      <w:start w:val="1"/>
+      <w:numFmt w:val="lowerLetter"/>
+      <w:lvlText w:val="%8."/>
+      <w:lvlJc w:val="left"/>
+      <w:pPr>
+        <w:ind w:left="5760" w:hanging="360"/>
+      </w:pPr>
+    </w:lvl>
+    <w:lvl w:ilvl="8" w:tplc="0409001B" w:tentative="1">
+      <w:start w:val="1"/>
+      <w:numFmt w:val="lowerRoman"/>
+      <w:lvlText w:val="%9."/>
+      <w:lvlJc w:val="right"/>
+      <w:pPr>
+        <w:ind w:left="6480" w:hanging="180"/>
+      </w:pPr>
+    </w:lvl>
+  </w:abstractNum>
   <w:num w:numId="1">
-    <w:abstractNumId w:val="7"/>
+    <w:abstractNumId w:val="8"/>
   </w:num>
   <w:num w:numId="2">
     <w:abstractNumId w:val="0"/>
@@ -1729,6 +2450,15 @@
   </w:num>
   <w:num w:numId="8">
     <w:abstractNumId w:val="4"/>
+  </w:num>
+  <w:num w:numId="9">
+    <w:abstractNumId w:val="9"/>
+  </w:num>
+  <w:num w:numId="10">
+    <w:abstractNumId w:val="7"/>
+  </w:num>
+  <w:num w:numId="11">
+    <w:abstractNumId w:val="10"/>
   </w:num>
 </w:numbering>
 </file>

</xml_diff>